<commit_message>
docs(bd): actualizar el diagrama, el diccionario de datos y el avance del corte 2
- Diagrama con estado_usuario y los estados nuevos de evento (En revisión, Rechazado) y de
  reserva (Usada).
- Diccionario de datos con lo mismo y la secuencia evento_numero_seq de los códigos de evento.
- Avance del corte 2 actualizado (mismas imágenes y tablas, texto ampliado).
</commit_message>
<xml_diff>
--- a/documents/BD/Avance_El_desparche_PI_2026-2_Corte_2.docx
+++ b/documents/BD/Avance_El_desparche_PI_2026-2_Corte_2.docx
@@ -57,15 +57,7 @@
         <w:jc w:val="center"/>
       </w:pPr>
       <w:r>
-        <w:t xml:space="preserve">Proyecto: El </w:t>
-      </w:r>
-      <w:proofErr w:type="spellStart"/>
-      <w:r>
-        <w:t>Desparche</w:t>
-      </w:r>
-      <w:proofErr w:type="spellEnd"/>
-      <w:r>
-        <w:t xml:space="preserve"> – Sistema web de gestión de eventos y reservas</w:t>
+        <w:t xml:space="preserve">Proyecto: El Desparche – Sistema web de gestión de eventos y reservas</w:t>
       </w:r>
     </w:p>
     <w:p>
@@ -139,15 +131,7 @@
         <w:spacing w:after="120" w:line="276" w:lineRule="auto"/>
       </w:pPr>
       <w:r>
-        <w:t xml:space="preserve">Una empresa nacional de entretenimiento necesita un sistema web para gestionar la organización de eventos y la administración de reservas, bajo un modelo similar al de plataformas como </w:t>
-      </w:r>
-      <w:proofErr w:type="spellStart"/>
-      <w:r>
-        <w:t>Tuboleta</w:t>
-      </w:r>
-      <w:proofErr w:type="spellEnd"/>
-      <w:r>
-        <w:t xml:space="preserve"> o Ticketmaster. A partir de las estructuras de datos y reglas de negocio del enunciado, la base de datos debe soportar:</w:t>
+        <w:t xml:space="preserve">Una empresa nacional de entretenimiento necesita un sistema web para gestionar la organización de eventos y la administración de reservas, bajo un modelo similar al de plataformas como Tuboleta o Ticketmaster. A partir de las estructuras de datos y reglas de negocio del enunciado, la base de datos debe soportar:</w:t>
       </w:r>
     </w:p>
     <w:p>
@@ -305,7 +289,7 @@
         <w:t>métodos de pago y pagos</w:t>
       </w:r>
       <w:r>
-        <w:t xml:space="preserve"> de las reservas y la </w:t>
+        <w:t xml:space="preserve"> de las reservas, la </w:t>
       </w:r>
       <w:r>
         <w:rPr>
@@ -315,7 +299,37 @@
         <w:t>ubicación</w:t>
       </w:r>
       <w:r>
-        <w:t xml:space="preserve"> detallada de los eventos.</w:t>
+        <w:t xml:space="preserve"> detallada de los eventos, el </w:t>
+      </w:r>
+      <w:r>
+        <w:rPr>
+          <w:b/>
+          <w:bCs/>
+        </w:rPr>
+        <w:t>estado de la cuenta</w:t>
+      </w:r>
+      <w:r>
+        <w:t xml:space="preserve"> de los usuarios (suspensión o bloqueo), la </w:t>
+      </w:r>
+      <w:r>
+        <w:rPr>
+          <w:b/>
+          <w:bCs/>
+        </w:rPr>
+        <w:t>revisión de los eventos</w:t>
+      </w:r>
+      <w:r>
+        <w:t xml:space="preserve"> que registran los agentes antes de publicarlos y la </w:t>
+      </w:r>
+      <w:r>
+        <w:rPr>
+          <w:b/>
+          <w:bCs/>
+        </w:rPr>
+        <w:t>validación de entradas</w:t>
+      </w:r>
+      <w:r>
+        <w:t xml:space="preserve"> en la puerta del evento.</w:t>
       </w:r>
     </w:p>
     <w:p>
@@ -501,77 +515,25 @@
             </w:tcMar>
           </w:tcPr>
           <w:p>
-            <w:proofErr w:type="spellStart"/>
+            <w:r>
+              <w:t xml:space="preserve">numero_identificacion, tipo_identificacion, nombre_completo, correo, contrasena_hash, direccion, telefono (multivaluado), fecha_registro, estado_usuario</w:t>
+            </w:r>
+          </w:p>
+        </w:tc>
+        <w:tc>
+          <w:tcPr>
+            <w:tcW w:w="1760" w:type="dxa"/>
+            <w:tcMar>
+              <w:top w:w="50" w:type="dxa"/>
+              <w:left w:w="90" w:type="dxa"/>
+              <w:bottom w:w="50" w:type="dxa"/>
+              <w:right w:w="90" w:type="dxa"/>
+            </w:tcMar>
+          </w:tcPr>
+          <w:p>
             <w:r>
               <w:t>numero_identificacion</w:t>
             </w:r>
-            <w:proofErr w:type="spellEnd"/>
-            <w:r>
-              <w:t xml:space="preserve">, </w:t>
-            </w:r>
-            <w:proofErr w:type="spellStart"/>
-            <w:r>
-              <w:t>tipo_identificacion</w:t>
-            </w:r>
-            <w:proofErr w:type="spellEnd"/>
-            <w:r>
-              <w:t xml:space="preserve">, </w:t>
-            </w:r>
-            <w:proofErr w:type="spellStart"/>
-            <w:r>
-              <w:t>nombre_completo</w:t>
-            </w:r>
-            <w:proofErr w:type="spellEnd"/>
-            <w:r>
-              <w:t xml:space="preserve">, correo, </w:t>
-            </w:r>
-            <w:proofErr w:type="spellStart"/>
-            <w:r>
-              <w:t>contrasena_hash</w:t>
-            </w:r>
-            <w:proofErr w:type="spellEnd"/>
-            <w:r>
-              <w:t xml:space="preserve">, </w:t>
-            </w:r>
-            <w:proofErr w:type="spellStart"/>
-            <w:r>
-              <w:t>direccion</w:t>
-            </w:r>
-            <w:proofErr w:type="spellEnd"/>
-            <w:r>
-              <w:t xml:space="preserve">, </w:t>
-            </w:r>
-            <w:proofErr w:type="spellStart"/>
-            <w:r>
-              <w:t>telefono</w:t>
-            </w:r>
-            <w:proofErr w:type="spellEnd"/>
-            <w:r>
-              <w:t xml:space="preserve"> (multivaluado), </w:t>
-            </w:r>
-            <w:proofErr w:type="spellStart"/>
-            <w:r>
-              <w:t>fecha_registro</w:t>
-            </w:r>
-            <w:proofErr w:type="spellEnd"/>
-          </w:p>
-        </w:tc>
-        <w:tc>
-          <w:tcPr>
-            <w:tcW w:w="1760" w:type="dxa"/>
-            <w:tcMar>
-              <w:top w:w="50" w:type="dxa"/>
-              <w:left w:w="90" w:type="dxa"/>
-              <w:bottom w:w="50" w:type="dxa"/>
-              <w:right w:w="90" w:type="dxa"/>
-            </w:tcMar>
-          </w:tcPr>
-          <w:p>
-            <w:proofErr w:type="spellStart"/>
-            <w:r>
-              <w:t>numero_identificacion</w:t>
-            </w:r>
-            <w:proofErr w:type="spellEnd"/>
           </w:p>
         </w:tc>
       </w:tr>
@@ -644,11 +606,9 @@
             </w:tcMar>
           </w:tcPr>
           <w:p>
-            <w:proofErr w:type="spellStart"/>
             <w:r>
               <w:t>numero_identificacion</w:t>
             </w:r>
-            <w:proofErr w:type="spellEnd"/>
           </w:p>
         </w:tc>
       </w:tr>
@@ -706,23 +666,7 @@
           </w:tcPr>
           <w:p>
             <w:r>
-              <w:t xml:space="preserve">puntos, publicidad, </w:t>
-            </w:r>
-            <w:proofErr w:type="spellStart"/>
-            <w:r>
-              <w:t>fecha_nacimiento</w:t>
-            </w:r>
-            <w:proofErr w:type="spellEnd"/>
-            <w:r>
-              <w:t xml:space="preserve">, edad (derivado), </w:t>
-            </w:r>
-            <w:proofErr w:type="spellStart"/>
-            <w:r>
-              <w:t>foto_perfil</w:t>
-            </w:r>
-            <w:proofErr w:type="spellEnd"/>
-            <w:r>
-              <w:t>, alias</w:t>
+              <w:t xml:space="preserve">puntos, publicidad, fecha_nacimiento, edad (derivado), foto_perfil, alias</w:t>
             </w:r>
           </w:p>
         </w:tc>
@@ -737,11 +681,9 @@
             </w:tcMar>
           </w:tcPr>
           <w:p>
-            <w:proofErr w:type="spellStart"/>
             <w:r>
               <w:t>numero_identificacion</w:t>
             </w:r>
-            <w:proofErr w:type="spellEnd"/>
           </w:p>
         </w:tc>
       </w:tr>
@@ -798,51 +740,9 @@
             </w:tcMar>
           </w:tcPr>
           <w:p>
-            <w:proofErr w:type="spellStart"/>
-            <w:r>
-              <w:t>comision</w:t>
-            </w:r>
-            <w:proofErr w:type="spellEnd"/>
-            <w:r>
-              <w:t xml:space="preserve">, experiencia, </w:t>
-            </w:r>
-            <w:proofErr w:type="spellStart"/>
-            <w:r>
-              <w:t>nit</w:t>
-            </w:r>
-            <w:proofErr w:type="spellEnd"/>
-            <w:r>
-              <w:t xml:space="preserve">, </w:t>
-            </w:r>
-            <w:proofErr w:type="spellStart"/>
-            <w:r>
-              <w:t>razon_social</w:t>
-            </w:r>
-            <w:proofErr w:type="spellEnd"/>
-            <w:r>
-              <w:t xml:space="preserve">, </w:t>
-            </w:r>
-            <w:proofErr w:type="spellStart"/>
-            <w:r>
-              <w:t>nombre_comercial</w:t>
-            </w:r>
-            <w:proofErr w:type="spellEnd"/>
-            <w:r>
-              <w:t xml:space="preserve">, </w:t>
-            </w:r>
-            <w:proofErr w:type="spellStart"/>
-            <w:r>
-              <w:t>descripcion</w:t>
-            </w:r>
-            <w:proofErr w:type="spellEnd"/>
-            <w:r>
-              <w:t xml:space="preserve">, </w:t>
-            </w:r>
-            <w:proofErr w:type="spellStart"/>
-            <w:r>
-              <w:t>logo_url</w:t>
-            </w:r>
-            <w:proofErr w:type="spellEnd"/>
+            <w:r>
+              <w:t xml:space="preserve">comision, experiencia, nit, razon_social, nombre_comercial, descripcion, logo_url</w:t>
+            </w:r>
           </w:p>
         </w:tc>
         <w:tc>
@@ -856,11 +756,9 @@
             </w:tcMar>
           </w:tcPr>
           <w:p>
-            <w:proofErr w:type="spellStart"/>
             <w:r>
               <w:t>numero_identificacion</w:t>
             </w:r>
-            <w:proofErr w:type="spellEnd"/>
           </w:p>
         </w:tc>
       </w:tr>
@@ -917,32 +815,25 @@
             </w:tcMar>
           </w:tcPr>
           <w:p>
-            <w:proofErr w:type="spellStart"/>
+            <w:r>
+              <w:t>id_pais, nombre</w:t>
+            </w:r>
+          </w:p>
+        </w:tc>
+        <w:tc>
+          <w:tcPr>
+            <w:tcW w:w="1760" w:type="dxa"/>
+            <w:tcMar>
+              <w:top w:w="50" w:type="dxa"/>
+              <w:left w:w="90" w:type="dxa"/>
+              <w:bottom w:w="50" w:type="dxa"/>
+              <w:right w:w="90" w:type="dxa"/>
+            </w:tcMar>
+          </w:tcPr>
+          <w:p>
             <w:r>
               <w:t>id_pais</w:t>
             </w:r>
-            <w:proofErr w:type="spellEnd"/>
-            <w:r>
-              <w:t>, nombre</w:t>
-            </w:r>
-          </w:p>
-        </w:tc>
-        <w:tc>
-          <w:tcPr>
-            <w:tcW w:w="1760" w:type="dxa"/>
-            <w:tcMar>
-              <w:top w:w="50" w:type="dxa"/>
-              <w:left w:w="90" w:type="dxa"/>
-              <w:bottom w:w="50" w:type="dxa"/>
-              <w:right w:w="90" w:type="dxa"/>
-            </w:tcMar>
-          </w:tcPr>
-          <w:p>
-            <w:proofErr w:type="spellStart"/>
-            <w:r>
-              <w:t>id_pais</w:t>
-            </w:r>
-            <w:proofErr w:type="spellEnd"/>
           </w:p>
         </w:tc>
       </w:tr>
@@ -999,32 +890,25 @@
             </w:tcMar>
           </w:tcPr>
           <w:p>
-            <w:proofErr w:type="spellStart"/>
+            <w:r>
+              <w:t>id_departamento, nombre</w:t>
+            </w:r>
+          </w:p>
+        </w:tc>
+        <w:tc>
+          <w:tcPr>
+            <w:tcW w:w="1760" w:type="dxa"/>
+            <w:tcMar>
+              <w:top w:w="50" w:type="dxa"/>
+              <w:left w:w="90" w:type="dxa"/>
+              <w:bottom w:w="50" w:type="dxa"/>
+              <w:right w:w="90" w:type="dxa"/>
+            </w:tcMar>
+          </w:tcPr>
+          <w:p>
             <w:r>
               <w:t>id_departamento</w:t>
             </w:r>
-            <w:proofErr w:type="spellEnd"/>
-            <w:r>
-              <w:t>, nombre</w:t>
-            </w:r>
-          </w:p>
-        </w:tc>
-        <w:tc>
-          <w:tcPr>
-            <w:tcW w:w="1760" w:type="dxa"/>
-            <w:tcMar>
-              <w:top w:w="50" w:type="dxa"/>
-              <w:left w:w="90" w:type="dxa"/>
-              <w:bottom w:w="50" w:type="dxa"/>
-              <w:right w:w="90" w:type="dxa"/>
-            </w:tcMar>
-          </w:tcPr>
-          <w:p>
-            <w:proofErr w:type="spellStart"/>
-            <w:r>
-              <w:t>id_departamento</w:t>
-            </w:r>
-            <w:proofErr w:type="spellEnd"/>
           </w:p>
         </w:tc>
       </w:tr>
@@ -1081,32 +965,25 @@
             </w:tcMar>
           </w:tcPr>
           <w:p>
-            <w:proofErr w:type="spellStart"/>
+            <w:r>
+              <w:t>id_ciudad, nombre</w:t>
+            </w:r>
+          </w:p>
+        </w:tc>
+        <w:tc>
+          <w:tcPr>
+            <w:tcW w:w="1760" w:type="dxa"/>
+            <w:tcMar>
+              <w:top w:w="50" w:type="dxa"/>
+              <w:left w:w="90" w:type="dxa"/>
+              <w:bottom w:w="50" w:type="dxa"/>
+              <w:right w:w="90" w:type="dxa"/>
+            </w:tcMar>
+          </w:tcPr>
+          <w:p>
             <w:r>
               <w:t>id_ciudad</w:t>
             </w:r>
-            <w:proofErr w:type="spellEnd"/>
-            <w:r>
-              <w:t>, nombre</w:t>
-            </w:r>
-          </w:p>
-        </w:tc>
-        <w:tc>
-          <w:tcPr>
-            <w:tcW w:w="1760" w:type="dxa"/>
-            <w:tcMar>
-              <w:top w:w="50" w:type="dxa"/>
-              <w:left w:w="90" w:type="dxa"/>
-              <w:bottom w:w="50" w:type="dxa"/>
-              <w:right w:w="90" w:type="dxa"/>
-            </w:tcMar>
-          </w:tcPr>
-          <w:p>
-            <w:proofErr w:type="spellStart"/>
-            <w:r>
-              <w:t>id_ciudad</w:t>
-            </w:r>
-            <w:proofErr w:type="spellEnd"/>
           </w:p>
         </w:tc>
       </w:tr>
@@ -1163,40 +1040,25 @@
             </w:tcMar>
           </w:tcPr>
           <w:p>
-            <w:proofErr w:type="spellStart"/>
+            <w:r>
+              <w:t xml:space="preserve">id_ubicacion, direccion, latitud, longitud</w:t>
+            </w:r>
+          </w:p>
+        </w:tc>
+        <w:tc>
+          <w:tcPr>
+            <w:tcW w:w="1760" w:type="dxa"/>
+            <w:tcMar>
+              <w:top w:w="50" w:type="dxa"/>
+              <w:left w:w="90" w:type="dxa"/>
+              <w:bottom w:w="50" w:type="dxa"/>
+              <w:right w:w="90" w:type="dxa"/>
+            </w:tcMar>
+          </w:tcPr>
+          <w:p>
             <w:r>
               <w:t>id_ubicacion</w:t>
             </w:r>
-            <w:proofErr w:type="spellEnd"/>
-            <w:r>
-              <w:t xml:space="preserve">, </w:t>
-            </w:r>
-            <w:proofErr w:type="spellStart"/>
-            <w:r>
-              <w:t>direccion</w:t>
-            </w:r>
-            <w:proofErr w:type="spellEnd"/>
-            <w:r>
-              <w:t>, latitud, longitud</w:t>
-            </w:r>
-          </w:p>
-        </w:tc>
-        <w:tc>
-          <w:tcPr>
-            <w:tcW w:w="1760" w:type="dxa"/>
-            <w:tcMar>
-              <w:top w:w="50" w:type="dxa"/>
-              <w:left w:w="90" w:type="dxa"/>
-              <w:bottom w:w="50" w:type="dxa"/>
-              <w:right w:w="90" w:type="dxa"/>
-            </w:tcMar>
-          </w:tcPr>
-          <w:p>
-            <w:proofErr w:type="spellStart"/>
-            <w:r>
-              <w:t>id_ubicacion</w:t>
-            </w:r>
-            <w:proofErr w:type="spellEnd"/>
           </w:p>
         </w:tc>
       </w:tr>
@@ -1253,93 +1115,25 @@
             </w:tcMar>
           </w:tcPr>
           <w:p>
-            <w:proofErr w:type="spellStart"/>
+            <w:r>
+              <w:t xml:space="preserve">codigo, nombre, descripcion, categoria, url_imagen, teatro, fecha_hora_inicio, fecha_hora_fin, capacidad_total, edad_minima, precio, observaciones, estado, fecha_creacion</w:t>
+            </w:r>
+          </w:p>
+        </w:tc>
+        <w:tc>
+          <w:tcPr>
+            <w:tcW w:w="1760" w:type="dxa"/>
+            <w:tcMar>
+              <w:top w:w="50" w:type="dxa"/>
+              <w:left w:w="90" w:type="dxa"/>
+              <w:bottom w:w="50" w:type="dxa"/>
+              <w:right w:w="90" w:type="dxa"/>
+            </w:tcMar>
+          </w:tcPr>
+          <w:p>
             <w:r>
               <w:t>codigo</w:t>
             </w:r>
-            <w:proofErr w:type="spellEnd"/>
-            <w:r>
-              <w:t xml:space="preserve">, nombre, </w:t>
-            </w:r>
-            <w:proofErr w:type="spellStart"/>
-            <w:r>
-              <w:t>descripcion</w:t>
-            </w:r>
-            <w:proofErr w:type="spellEnd"/>
-            <w:r>
-              <w:t xml:space="preserve">, </w:t>
-            </w:r>
-            <w:proofErr w:type="spellStart"/>
-            <w:r>
-              <w:t>categoria</w:t>
-            </w:r>
-            <w:proofErr w:type="spellEnd"/>
-            <w:r>
-              <w:t xml:space="preserve">, </w:t>
-            </w:r>
-            <w:proofErr w:type="spellStart"/>
-            <w:r>
-              <w:t>url_imagen</w:t>
-            </w:r>
-            <w:proofErr w:type="spellEnd"/>
-            <w:r>
-              <w:t xml:space="preserve">, teatro, </w:t>
-            </w:r>
-            <w:proofErr w:type="spellStart"/>
-            <w:r>
-              <w:t>fecha_hora_inicio</w:t>
-            </w:r>
-            <w:proofErr w:type="spellEnd"/>
-            <w:r>
-              <w:t xml:space="preserve">, </w:t>
-            </w:r>
-            <w:proofErr w:type="spellStart"/>
-            <w:r>
-              <w:t>fecha_hora_fin</w:t>
-            </w:r>
-            <w:proofErr w:type="spellEnd"/>
-            <w:r>
-              <w:t xml:space="preserve">, </w:t>
-            </w:r>
-            <w:proofErr w:type="spellStart"/>
-            <w:r>
-              <w:t>capacidad_total</w:t>
-            </w:r>
-            <w:proofErr w:type="spellEnd"/>
-            <w:r>
-              <w:t xml:space="preserve">, </w:t>
-            </w:r>
-            <w:proofErr w:type="spellStart"/>
-            <w:r>
-              <w:t>edad_minima</w:t>
-            </w:r>
-            <w:proofErr w:type="spellEnd"/>
-            <w:r>
-              <w:t xml:space="preserve">, precio, observaciones, estado, </w:t>
-            </w:r>
-            <w:proofErr w:type="spellStart"/>
-            <w:r>
-              <w:t>fecha_creacion</w:t>
-            </w:r>
-            <w:proofErr w:type="spellEnd"/>
-          </w:p>
-        </w:tc>
-        <w:tc>
-          <w:tcPr>
-            <w:tcW w:w="1760" w:type="dxa"/>
-            <w:tcMar>
-              <w:top w:w="50" w:type="dxa"/>
-              <w:left w:w="90" w:type="dxa"/>
-              <w:bottom w:w="50" w:type="dxa"/>
-              <w:right w:w="90" w:type="dxa"/>
-            </w:tcMar>
-          </w:tcPr>
-          <w:p>
-            <w:proofErr w:type="spellStart"/>
-            <w:r>
-              <w:t>codigo</w:t>
-            </w:r>
-            <w:proofErr w:type="spellEnd"/>
           </w:p>
         </w:tc>
       </w:tr>
@@ -1396,64 +1190,25 @@
             </w:tcMar>
           </w:tcPr>
           <w:p>
-            <w:proofErr w:type="spellStart"/>
+            <w:r>
+              <w:t xml:space="preserve">id_reserva, fecha_hora, valor_total, numero_entradas, codigo_qr, observaciones, estado</w:t>
+            </w:r>
+          </w:p>
+        </w:tc>
+        <w:tc>
+          <w:tcPr>
+            <w:tcW w:w="1760" w:type="dxa"/>
+            <w:tcMar>
+              <w:top w:w="50" w:type="dxa"/>
+              <w:left w:w="90" w:type="dxa"/>
+              <w:bottom w:w="50" w:type="dxa"/>
+              <w:right w:w="90" w:type="dxa"/>
+            </w:tcMar>
+          </w:tcPr>
+          <w:p>
             <w:r>
               <w:t>id_reserva</w:t>
             </w:r>
-            <w:proofErr w:type="spellEnd"/>
-            <w:r>
-              <w:t xml:space="preserve">, </w:t>
-            </w:r>
-            <w:proofErr w:type="spellStart"/>
-            <w:r>
-              <w:t>fecha_hora</w:t>
-            </w:r>
-            <w:proofErr w:type="spellEnd"/>
-            <w:r>
-              <w:t xml:space="preserve">, </w:t>
-            </w:r>
-            <w:proofErr w:type="spellStart"/>
-            <w:r>
-              <w:t>valor_total</w:t>
-            </w:r>
-            <w:proofErr w:type="spellEnd"/>
-            <w:r>
-              <w:t xml:space="preserve">, </w:t>
-            </w:r>
-            <w:proofErr w:type="spellStart"/>
-            <w:r>
-              <w:t>numero_entradas</w:t>
-            </w:r>
-            <w:proofErr w:type="spellEnd"/>
-            <w:r>
-              <w:t xml:space="preserve">, </w:t>
-            </w:r>
-            <w:proofErr w:type="spellStart"/>
-            <w:r>
-              <w:t>codigo_qr</w:t>
-            </w:r>
-            <w:proofErr w:type="spellEnd"/>
-            <w:r>
-              <w:t>, observaciones, estado</w:t>
-            </w:r>
-          </w:p>
-        </w:tc>
-        <w:tc>
-          <w:tcPr>
-            <w:tcW w:w="1760" w:type="dxa"/>
-            <w:tcMar>
-              <w:top w:w="50" w:type="dxa"/>
-              <w:left w:w="90" w:type="dxa"/>
-              <w:bottom w:w="50" w:type="dxa"/>
-              <w:right w:w="90" w:type="dxa"/>
-            </w:tcMar>
-          </w:tcPr>
-          <w:p>
-            <w:proofErr w:type="spellStart"/>
-            <w:r>
-              <w:t>id_reserva</w:t>
-            </w:r>
-            <w:proofErr w:type="spellEnd"/>
           </w:p>
         </w:tc>
       </w:tr>
@@ -1511,53 +1266,25 @@
             </w:tcMar>
           </w:tcPr>
           <w:p>
-            <w:proofErr w:type="spellStart"/>
+            <w:r>
+              <w:t xml:space="preserve">id_metodo, tipo, proveedor, referencia_visible, token_pasarela, activo, fecha_registro</w:t>
+            </w:r>
+          </w:p>
+        </w:tc>
+        <w:tc>
+          <w:tcPr>
+            <w:tcW w:w="1760" w:type="dxa"/>
+            <w:tcMar>
+              <w:top w:w="50" w:type="dxa"/>
+              <w:left w:w="90" w:type="dxa"/>
+              <w:bottom w:w="50" w:type="dxa"/>
+              <w:right w:w="90" w:type="dxa"/>
+            </w:tcMar>
+          </w:tcPr>
+          <w:p>
             <w:r>
               <w:t>id_metodo</w:t>
             </w:r>
-            <w:proofErr w:type="spellEnd"/>
-            <w:r>
-              <w:t xml:space="preserve">, tipo, proveedor, </w:t>
-            </w:r>
-            <w:proofErr w:type="spellStart"/>
-            <w:r>
-              <w:t>referencia_visible</w:t>
-            </w:r>
-            <w:proofErr w:type="spellEnd"/>
-            <w:r>
-              <w:t xml:space="preserve">, </w:t>
-            </w:r>
-            <w:proofErr w:type="spellStart"/>
-            <w:r>
-              <w:t>token_pasarela</w:t>
-            </w:r>
-            <w:proofErr w:type="spellEnd"/>
-            <w:r>
-              <w:t xml:space="preserve">, activo, </w:t>
-            </w:r>
-            <w:proofErr w:type="spellStart"/>
-            <w:r>
-              <w:t>fecha_registro</w:t>
-            </w:r>
-            <w:proofErr w:type="spellEnd"/>
-          </w:p>
-        </w:tc>
-        <w:tc>
-          <w:tcPr>
-            <w:tcW w:w="1760" w:type="dxa"/>
-            <w:tcMar>
-              <w:top w:w="50" w:type="dxa"/>
-              <w:left w:w="90" w:type="dxa"/>
-              <w:bottom w:w="50" w:type="dxa"/>
-              <w:right w:w="90" w:type="dxa"/>
-            </w:tcMar>
-          </w:tcPr>
-          <w:p>
-            <w:proofErr w:type="spellStart"/>
-            <w:r>
-              <w:t>id_metodo</w:t>
-            </w:r>
-            <w:proofErr w:type="spellEnd"/>
           </w:p>
         </w:tc>
       </w:tr>
@@ -1614,48 +1341,25 @@
             </w:tcMar>
           </w:tcPr>
           <w:p>
-            <w:proofErr w:type="spellStart"/>
+            <w:r>
+              <w:t xml:space="preserve">id_pago, monto, fecha_hora, referencia_transaccion, estado</w:t>
+            </w:r>
+          </w:p>
+        </w:tc>
+        <w:tc>
+          <w:tcPr>
+            <w:tcW w:w="1760" w:type="dxa"/>
+            <w:tcMar>
+              <w:top w:w="50" w:type="dxa"/>
+              <w:left w:w="90" w:type="dxa"/>
+              <w:bottom w:w="50" w:type="dxa"/>
+              <w:right w:w="90" w:type="dxa"/>
+            </w:tcMar>
+          </w:tcPr>
+          <w:p>
             <w:r>
               <w:t>id_pago</w:t>
             </w:r>
-            <w:proofErr w:type="spellEnd"/>
-            <w:r>
-              <w:t xml:space="preserve">, monto, </w:t>
-            </w:r>
-            <w:proofErr w:type="spellStart"/>
-            <w:r>
-              <w:t>fecha_hora</w:t>
-            </w:r>
-            <w:proofErr w:type="spellEnd"/>
-            <w:r>
-              <w:t xml:space="preserve">, </w:t>
-            </w:r>
-            <w:proofErr w:type="spellStart"/>
-            <w:r>
-              <w:t>referencia_transaccion</w:t>
-            </w:r>
-            <w:proofErr w:type="spellEnd"/>
-            <w:r>
-              <w:t>, estado</w:t>
-            </w:r>
-          </w:p>
-        </w:tc>
-        <w:tc>
-          <w:tcPr>
-            <w:tcW w:w="1760" w:type="dxa"/>
-            <w:tcMar>
-              <w:top w:w="50" w:type="dxa"/>
-              <w:left w:w="90" w:type="dxa"/>
-              <w:bottom w:w="50" w:type="dxa"/>
-              <w:right w:w="90" w:type="dxa"/>
-            </w:tcMar>
-          </w:tcPr>
-          <w:p>
-            <w:proofErr w:type="spellStart"/>
-            <w:r>
-              <w:t>id_pago</w:t>
-            </w:r>
-            <w:proofErr w:type="spellEnd"/>
           </w:p>
         </w:tc>
       </w:tr>
@@ -1669,7 +1373,6 @@
       <w:pPr>
         <w:spacing w:after="120" w:line="276" w:lineRule="auto"/>
       </w:pPr>
-      <w:proofErr w:type="spellStart"/>
       <w:r>
         <w:rPr>
           <w:b/>
@@ -1677,19 +1380,9 @@
         </w:rPr>
         <w:t>numero_identificacion</w:t>
       </w:r>
-      <w:proofErr w:type="spellEnd"/>
-      <w:r>
-        <w:t xml:space="preserve"> es la clave primaria de USUARIO porque no se repite entre personas, así que es mejor clave candidata que un id genérico. No se usa un atributo </w:t>
-      </w:r>
-      <w:proofErr w:type="spellStart"/>
-      <w:r>
-        <w:t>tipo_usuario</w:t>
-      </w:r>
-      <w:proofErr w:type="spellEnd"/>
-      <w:r>
-        <w:t xml:space="preserve">, porque el tipo de persona queda definido por la generalización. </w:t>
-      </w:r>
-      <w:proofErr w:type="spellStart"/>
+      <w:r>
+        <w:t xml:space="preserve"> es la clave primaria de USUARIO porque no se repite entre personas, así que es mejor clave candidata que un id genérico. No se usa un atributo tipo_usuario, porque el tipo de persona queda definido por la generalización. </w:t>
+      </w:r>
       <w:r>
         <w:rPr>
           <w:b/>
@@ -1697,7 +1390,6 @@
         </w:rPr>
         <w:t>telefono</w:t>
       </w:r>
-      <w:proofErr w:type="spellEnd"/>
       <w:r>
         <w:t xml:space="preserve"> es multivaluado y </w:t>
       </w:r>
@@ -1912,15 +1604,7 @@
           </w:tcPr>
           <w:p>
             <w:r>
-              <w:t xml:space="preserve">FK </w:t>
-            </w:r>
-            <w:proofErr w:type="spellStart"/>
-            <w:r>
-              <w:t>id_pais</w:t>
-            </w:r>
-            <w:proofErr w:type="spellEnd"/>
-            <w:r>
-              <w:t xml:space="preserve"> NOT NULL en DEPARTAMENTO</w:t>
+              <w:t xml:space="preserve">FK id_pais NOT NULL en DEPARTAMENTO</w:t>
             </w:r>
           </w:p>
         </w:tc>
@@ -1995,15 +1679,7 @@
           </w:tcPr>
           <w:p>
             <w:r>
-              <w:t xml:space="preserve">FK </w:t>
-            </w:r>
-            <w:proofErr w:type="spellStart"/>
-            <w:r>
-              <w:t>id_departamento</w:t>
-            </w:r>
-            <w:proofErr w:type="spellEnd"/>
-            <w:r>
-              <w:t xml:space="preserve"> NOT NULL en CIUDAD</w:t>
+              <w:t xml:space="preserve">FK id_departamento NOT NULL en CIUDAD</w:t>
             </w:r>
           </w:p>
         </w:tc>
@@ -2078,15 +1754,7 @@
           </w:tcPr>
           <w:p>
             <w:r>
-              <w:t xml:space="preserve">FK </w:t>
-            </w:r>
-            <w:proofErr w:type="spellStart"/>
-            <w:r>
-              <w:t>id_ciudad</w:t>
-            </w:r>
-            <w:proofErr w:type="spellEnd"/>
-            <w:r>
-              <w:t xml:space="preserve"> NOT NULL en UBICACION</w:t>
+              <w:t xml:space="preserve">FK id_ciudad NOT NULL en UBICACION</w:t>
             </w:r>
           </w:p>
         </w:tc>
@@ -2112,11 +1780,9 @@
             </w:tcMar>
           </w:tcPr>
           <w:p>
-            <w:proofErr w:type="spellStart"/>
             <w:r>
               <w:t>UbiPer</w:t>
             </w:r>
-            <w:proofErr w:type="spellEnd"/>
           </w:p>
         </w:tc>
         <w:tc>
@@ -2163,15 +1829,7 @@
           </w:tcPr>
           <w:p>
             <w:r>
-              <w:t xml:space="preserve">FK </w:t>
-            </w:r>
-            <w:proofErr w:type="spellStart"/>
-            <w:r>
-              <w:t>id_ciudad</w:t>
-            </w:r>
-            <w:proofErr w:type="spellEnd"/>
-            <w:r>
-              <w:t xml:space="preserve"> NOT NULL en USUARIO</w:t>
+              <w:t xml:space="preserve">FK id_ciudad NOT NULL en USUARIO</w:t>
             </w:r>
           </w:p>
         </w:tc>
@@ -2197,11 +1855,9 @@
             </w:tcMar>
           </w:tcPr>
           <w:p>
-            <w:proofErr w:type="spellStart"/>
             <w:r>
               <w:t>UbiEve</w:t>
             </w:r>
-            <w:proofErr w:type="spellEnd"/>
           </w:p>
         </w:tc>
         <w:tc>
@@ -2248,15 +1904,7 @@
           </w:tcPr>
           <w:p>
             <w:r>
-              <w:t xml:space="preserve">FK </w:t>
-            </w:r>
-            <w:proofErr w:type="spellStart"/>
-            <w:r>
-              <w:t>id_ubicacion</w:t>
-            </w:r>
-            <w:proofErr w:type="spellEnd"/>
-            <w:r>
-              <w:t xml:space="preserve"> NOT NULL en EVENTO</w:t>
+              <w:t xml:space="preserve">FK id_ubicacion NOT NULL en EVENTO</w:t>
             </w:r>
           </w:p>
         </w:tc>
@@ -2331,15 +1979,7 @@
           </w:tcPr>
           <w:p>
             <w:r>
-              <w:t xml:space="preserve">FK </w:t>
-            </w:r>
-            <w:proofErr w:type="spellStart"/>
-            <w:r>
-              <w:t>numero_identificacion</w:t>
-            </w:r>
-            <w:proofErr w:type="spellEnd"/>
-            <w:r>
-              <w:t xml:space="preserve"> NOT NULL en EVENTO</w:t>
+              <w:t xml:space="preserve">FK numero_identificacion NOT NULL en EVENTO</w:t>
             </w:r>
           </w:p>
         </w:tc>
@@ -2414,15 +2054,7 @@
           </w:tcPr>
           <w:p>
             <w:r>
-              <w:t xml:space="preserve">FK </w:t>
-            </w:r>
-            <w:proofErr w:type="spellStart"/>
-            <w:r>
-              <w:t>numero_identificacion</w:t>
-            </w:r>
-            <w:proofErr w:type="spellEnd"/>
-            <w:r>
-              <w:t xml:space="preserve"> NOT NULL en RESERVA</w:t>
+              <w:t xml:space="preserve">FK numero_identificacion NOT NULL en RESERVA</w:t>
             </w:r>
           </w:p>
         </w:tc>
@@ -2497,15 +2129,7 @@
           </w:tcPr>
           <w:p>
             <w:r>
-              <w:t xml:space="preserve">FK </w:t>
-            </w:r>
-            <w:proofErr w:type="spellStart"/>
-            <w:r>
-              <w:t>codigo_evento</w:t>
-            </w:r>
-            <w:proofErr w:type="spellEnd"/>
-            <w:r>
-              <w:t xml:space="preserve"> NOT NULL en RESERVA</w:t>
+              <w:t xml:space="preserve">FK codigo_evento NOT NULL en RESERVA</w:t>
             </w:r>
           </w:p>
         </w:tc>
@@ -2580,15 +2204,7 @@
           </w:tcPr>
           <w:p>
             <w:r>
-              <w:t xml:space="preserve">FK </w:t>
-            </w:r>
-            <w:proofErr w:type="spellStart"/>
-            <w:r>
-              <w:t>numero_identificacion</w:t>
-            </w:r>
-            <w:proofErr w:type="spellEnd"/>
-            <w:r>
-              <w:t xml:space="preserve"> NOT NULL en METODO_PAGO</w:t>
+              <w:t xml:space="preserve">FK numero_identificacion NOT NULL en METODO_PAGO</w:t>
             </w:r>
           </w:p>
         </w:tc>
@@ -2663,15 +2279,7 @@
           </w:tcPr>
           <w:p>
             <w:r>
-              <w:t xml:space="preserve">FK </w:t>
-            </w:r>
-            <w:proofErr w:type="spellStart"/>
-            <w:r>
-              <w:t>id_reserva</w:t>
-            </w:r>
-            <w:proofErr w:type="spellEnd"/>
-            <w:r>
-              <w:t xml:space="preserve"> NOT NULL en PAGO</w:t>
+              <w:t xml:space="preserve">FK id_reserva NOT NULL en PAGO</w:t>
             </w:r>
           </w:p>
         </w:tc>
@@ -2746,15 +2354,7 @@
           </w:tcPr>
           <w:p>
             <w:r>
-              <w:t xml:space="preserve">FK </w:t>
-            </w:r>
-            <w:proofErr w:type="spellStart"/>
-            <w:r>
-              <w:t>id_metodo</w:t>
-            </w:r>
-            <w:proofErr w:type="spellEnd"/>
-            <w:r>
-              <w:t xml:space="preserve"> NOT NULL en PAGO</w:t>
+              <w:t xml:space="preserve">FK id_metodo NOT NULL en PAGO</w:t>
             </w:r>
           </w:p>
         </w:tc>
@@ -2845,23 +2445,7 @@
         <w:spacing w:after="120" w:line="276" w:lineRule="auto"/>
       </w:pPr>
       <w:r>
-        <w:t>En el diagrama, la pareja (</w:t>
-      </w:r>
-      <w:proofErr w:type="spellStart"/>
-      <w:r>
-        <w:t>mín</w:t>
-      </w:r>
-      <w:proofErr w:type="spellEnd"/>
-      <w:r>
-        <w:t xml:space="preserve">, </w:t>
-      </w:r>
-      <w:proofErr w:type="spellStart"/>
-      <w:r>
-        <w:t>máx</w:t>
-      </w:r>
-      <w:proofErr w:type="spellEnd"/>
-      <w:r>
-        <w:t>) junto a cada entidad indica cuántas instancias de esa entidad se relacionan con una instancia de la otra, y la línea doble indica participación total. En todas las relaciones 1:N el lado “uno” tiene (1,1): cada registro del lado “muchos” siempre debe estar asociado, por eso sus llaves foráneas son NOT NULL.</w:t>
+        <w:t xml:space="preserve">En el diagrama, la pareja (mín, máx) junto a cada entidad indica cuántas instancias de esa entidad se relacionan con una instancia de la otra, y la línea doble indica participación total. En todas las relaciones 1:N el lado “uno” tiene (1,1): cada registro del lado “muchos” siempre debe estar asociado, por eso sus llaves foráneas son NOT NULL.</w:t>
       </w:r>
     </w:p>
     <w:p>
@@ -2890,15 +2474,7 @@
         <w:spacing w:after="60" w:line="276" w:lineRule="auto"/>
       </w:pPr>
       <w:r>
-        <w:t xml:space="preserve">Diagrama elaborado en Draw.io (archivo </w:t>
-      </w:r>
-      <w:proofErr w:type="spellStart"/>
-      <w:r>
-        <w:t>Diagrama_corregido.drawio</w:t>
-      </w:r>
-      <w:proofErr w:type="spellEnd"/>
-      <w:r>
-        <w:t>). Vista completa:</w:t>
+        <w:t xml:space="preserve">Diagrama elaborado en Draw.io (archivo Diagrama_corregido.drawio). Vista completa:</w:t>
       </w:r>
     </w:p>
     <w:p>
@@ -3272,15 +2848,7 @@
         <w:spacing w:after="60" w:line="276" w:lineRule="auto"/>
       </w:pPr>
       <w:r>
-        <w:t xml:space="preserve">El atributo multivaluado </w:t>
-      </w:r>
-      <w:proofErr w:type="spellStart"/>
-      <w:r>
-        <w:t>telefono</w:t>
-      </w:r>
-      <w:proofErr w:type="spellEnd"/>
-      <w:r>
-        <w:t xml:space="preserve"> genera la tabla USUARIO_TELEFONO con PK compuesta.</w:t>
+        <w:t xml:space="preserve">El atributo multivaluado telefono genera la tabla USUARIO_TELEFONO con PK compuesta.</w:t>
       </w:r>
     </w:p>
     <w:p>
@@ -3331,24 +2899,33 @@
       <w:r>
         <w:t>PAIS(</w:t>
       </w:r>
-      <w:proofErr w:type="spellStart"/>
       <w:r>
         <w:rPr>
           <w:b/>
           <w:bCs/>
         </w:rPr>
-        <w:t>id_pais</w:t>
-      </w:r>
-      <w:proofErr w:type="spellEnd"/>
+        <w:t xml:space="preserve">id_pais PK</w:t>
+      </w:r>
+      <w:r>
+        <w:t>, nombre)</w:t>
+      </w:r>
+    </w:p>
+    <w:p>
+      <w:pPr>
+        <w:spacing w:after="140" w:line="276" w:lineRule="auto"/>
+      </w:pPr>
+      <w:r>
+        <w:t>DEPARTAMENTO(</w:t>
+      </w:r>
       <w:r>
         <w:rPr>
           <w:b/>
           <w:bCs/>
         </w:rPr>
-        <w:t xml:space="preserve"> PK</w:t>
-      </w:r>
-      <w:r>
-        <w:t>, nombre)</w:t>
+        <w:t xml:space="preserve">id_departamento PK</w:t>
+      </w:r>
+      <w:r>
+        <w:t xml:space="preserve">, nombre, id_pais FK NOT NULL)</w:t>
       </w:r>
     </w:p>
     <w:p>
@@ -3356,34 +2933,45 @@
         <w:spacing w:after="140" w:line="276" w:lineRule="auto"/>
       </w:pPr>
       <w:r>
-        <w:t>DEPARTAMENTO(</w:t>
-      </w:r>
-      <w:proofErr w:type="spellStart"/>
+        <w:t>CIUDAD(</w:t>
+      </w:r>
       <w:r>
         <w:rPr>
           <w:b/>
           <w:bCs/>
         </w:rPr>
-        <w:t>id_departamento</w:t>
-      </w:r>
-      <w:proofErr w:type="spellEnd"/>
+        <w:t xml:space="preserve">id_ciudad PK</w:t>
+      </w:r>
+      <w:r>
+        <w:t xml:space="preserve">, nombre, id_departamento FK NOT NULL)</w:t>
+      </w:r>
+    </w:p>
+    <w:p>
+      <w:pPr>
+        <w:spacing w:after="140" w:line="276" w:lineRule="auto"/>
+      </w:pPr>
+      <w:r>
+        <w:t>UBICACION(</w:t>
+      </w:r>
       <w:r>
         <w:rPr>
           <w:b/>
           <w:bCs/>
         </w:rPr>
-        <w:t xml:space="preserve"> PK</w:t>
-      </w:r>
-      <w:r>
-        <w:t xml:space="preserve">, nombre, </w:t>
-      </w:r>
-      <w:proofErr w:type="spellStart"/>
-      <w:r>
-        <w:t>id_pais</w:t>
-      </w:r>
-      <w:proofErr w:type="spellEnd"/>
-      <w:r>
-        <w:t xml:space="preserve"> FK NOT NULL)</w:t>
+        <w:t xml:space="preserve">id_ubicacion PK</w:t>
+      </w:r>
+      <w:r>
+        <w:t xml:space="preserve">, direccion, latitud, longitud, id_ciudad FK NOT NULL)</w:t>
+      </w:r>
+    </w:p>
+    <w:p>
+      <w:pPr>
+        <w:pStyle w:val="Ttulo2"/>
+        <w:keepNext/>
+        <w:spacing w:before="200" w:after="100"/>
+      </w:pPr>
+      <w:r>
+        <w:t>Usuarios (generalización USUARIO → ADMIN, CLIENTE, AGENTE)</w:t>
       </w:r>
     </w:p>
     <w:p>
@@ -3391,87 +2979,63 @@
         <w:spacing w:after="140" w:line="276" w:lineRule="auto"/>
       </w:pPr>
       <w:r>
-        <w:t>CIUDAD(</w:t>
-      </w:r>
-      <w:proofErr w:type="spellStart"/>
+        <w:t>USUARIO(</w:t>
+      </w:r>
       <w:r>
         <w:rPr>
           <w:b/>
           <w:bCs/>
         </w:rPr>
-        <w:t>id_ciudad</w:t>
-      </w:r>
-      <w:proofErr w:type="spellEnd"/>
+        <w:t xml:space="preserve">numero_identificacion PK</w:t>
+      </w:r>
+      <w:r>
+        <w:t xml:space="preserve">, tipo_identificacion, nombre_completo, correo, contrasena_hash, direccion, fecha_registro, estado_usuario NOT NULL, id_ciudad FK NOT NULL)</w:t>
+      </w:r>
+    </w:p>
+    <w:p>
+      <w:pPr>
+        <w:spacing w:after="140" w:line="276" w:lineRule="auto"/>
+      </w:pPr>
+      <w:r>
+        <w:t>USUARIO_TELEFONO(</w:t>
+      </w:r>
       <w:r>
         <w:rPr>
           <w:b/>
           <w:bCs/>
         </w:rPr>
-        <w:t xml:space="preserve"> PK</w:t>
-      </w:r>
-      <w:r>
-        <w:t xml:space="preserve">, nombre, </w:t>
-      </w:r>
-      <w:proofErr w:type="spellStart"/>
-      <w:r>
-        <w:t>id_departamento</w:t>
-      </w:r>
-      <w:proofErr w:type="spellEnd"/>
-      <w:r>
-        <w:t xml:space="preserve"> FK NOT NULL)</w:t>
-      </w:r>
-    </w:p>
-    <w:p>
-      <w:pPr>
-        <w:spacing w:after="140" w:line="276" w:lineRule="auto"/>
-      </w:pPr>
-      <w:r>
-        <w:t>UBICACION(</w:t>
-      </w:r>
-      <w:proofErr w:type="spellStart"/>
+        <w:t xml:space="preserve">numero_identificacion PK FK</w:t>
+      </w:r>
+      <w:r>
+        <w:t xml:space="preserve">, </w:t>
+      </w:r>
       <w:r>
         <w:rPr>
           <w:b/>
           <w:bCs/>
         </w:rPr>
-        <w:t>id_ubicacion</w:t>
-      </w:r>
-      <w:proofErr w:type="spellEnd"/>
+        <w:t xml:space="preserve">telefono PK</w:t>
+      </w:r>
+      <w:r>
+        <w:t>)</w:t>
+      </w:r>
+    </w:p>
+    <w:p>
+      <w:pPr>
+        <w:spacing w:after="140" w:line="276" w:lineRule="auto"/>
+      </w:pPr>
+      <w:r>
+        <w:t>ADMIN(</w:t>
+      </w:r>
       <w:r>
         <w:rPr>
           <w:b/>
           <w:bCs/>
         </w:rPr>
-        <w:t xml:space="preserve"> PK</w:t>
-      </w:r>
-      <w:r>
-        <w:t xml:space="preserve">, </w:t>
-      </w:r>
-      <w:proofErr w:type="spellStart"/>
-      <w:r>
-        <w:t>direccion</w:t>
-      </w:r>
-      <w:proofErr w:type="spellEnd"/>
-      <w:r>
-        <w:t xml:space="preserve">, latitud, longitud, </w:t>
-      </w:r>
-      <w:proofErr w:type="spellStart"/>
-      <w:r>
-        <w:t>id_ciudad</w:t>
-      </w:r>
-      <w:proofErr w:type="spellEnd"/>
-      <w:r>
-        <w:t xml:space="preserve"> FK NOT NULL)</w:t>
-      </w:r>
-    </w:p>
-    <w:p>
-      <w:pPr>
-        <w:pStyle w:val="Ttulo2"/>
-        <w:keepNext/>
-        <w:spacing w:before="200" w:after="100"/>
-      </w:pPr>
-      <w:r>
-        <w:t>Usuarios (generalización USUARIO → ADMIN, CLIENTE, AGENTE)</w:t>
+        <w:t xml:space="preserve">numero_identificacion PK FK</w:t>
+      </w:r>
+      <w:r>
+        <w:t>, salario, horario)</w:t>
       </w:r>
     </w:p>
     <w:p>
@@ -3479,74 +3043,45 @@
         <w:spacing w:after="140" w:line="276" w:lineRule="auto"/>
       </w:pPr>
       <w:r>
-        <w:t>USUARIO(</w:t>
-      </w:r>
-      <w:proofErr w:type="spellStart"/>
+        <w:t>CLIENTE(</w:t>
+      </w:r>
       <w:r>
         <w:rPr>
           <w:b/>
           <w:bCs/>
         </w:rPr>
-        <w:t>numero_identificacion</w:t>
-      </w:r>
-      <w:proofErr w:type="spellEnd"/>
+        <w:t xml:space="preserve">numero_identificacion PK FK</w:t>
+      </w:r>
+      <w:r>
+        <w:t xml:space="preserve">, puntos, publicidad, fecha_nacimiento, foto_perfil, alias)</w:t>
+      </w:r>
+    </w:p>
+    <w:p>
+      <w:pPr>
+        <w:spacing w:after="140" w:line="276" w:lineRule="auto"/>
+      </w:pPr>
+      <w:r>
+        <w:t>AGENTE(</w:t>
+      </w:r>
       <w:r>
         <w:rPr>
           <w:b/>
           <w:bCs/>
         </w:rPr>
-        <w:t xml:space="preserve"> PK</w:t>
-      </w:r>
-      <w:r>
-        <w:t xml:space="preserve">, </w:t>
-      </w:r>
-      <w:proofErr w:type="spellStart"/>
-      <w:r>
-        <w:t>tipo_identificacion</w:t>
-      </w:r>
-      <w:proofErr w:type="spellEnd"/>
-      <w:r>
-        <w:t xml:space="preserve">, </w:t>
-      </w:r>
-      <w:proofErr w:type="spellStart"/>
-      <w:r>
-        <w:t>nombre_completo</w:t>
-      </w:r>
-      <w:proofErr w:type="spellEnd"/>
-      <w:r>
-        <w:t xml:space="preserve">, correo, </w:t>
-      </w:r>
-      <w:proofErr w:type="spellStart"/>
-      <w:r>
-        <w:t>contrasena_hash</w:t>
-      </w:r>
-      <w:proofErr w:type="spellEnd"/>
-      <w:r>
-        <w:t xml:space="preserve">, </w:t>
-      </w:r>
-      <w:proofErr w:type="spellStart"/>
-      <w:r>
-        <w:t>direccion</w:t>
-      </w:r>
-      <w:proofErr w:type="spellEnd"/>
-      <w:r>
-        <w:t xml:space="preserve">, </w:t>
-      </w:r>
-      <w:proofErr w:type="spellStart"/>
-      <w:r>
-        <w:t>fecha_registro</w:t>
-      </w:r>
-      <w:proofErr w:type="spellEnd"/>
-      <w:r>
-        <w:t xml:space="preserve">, </w:t>
-      </w:r>
-      <w:proofErr w:type="spellStart"/>
-      <w:r>
-        <w:t>id_ciudad</w:t>
-      </w:r>
-      <w:proofErr w:type="spellEnd"/>
-      <w:r>
-        <w:t xml:space="preserve"> FK NOT NULL)</w:t>
+        <w:t xml:space="preserve">numero_identificacion PK FK</w:t>
+      </w:r>
+      <w:r>
+        <w:t xml:space="preserve">, comision, experiencia, nit, razon_social, nombre_comercial, descripcion, logo_url)</w:t>
+      </w:r>
+    </w:p>
+    <w:p>
+      <w:pPr>
+        <w:pStyle w:val="Ttulo2"/>
+        <w:keepNext/>
+        <w:spacing w:before="200" w:after="100"/>
+      </w:pPr>
+      <w:r>
+        <w:t>Eventos y reservas</w:t>
       </w:r>
     </w:p>
     <w:p>
@@ -3554,511 +3089,82 @@
         <w:spacing w:after="140" w:line="276" w:lineRule="auto"/>
       </w:pPr>
       <w:r>
-        <w:t>USUARIO_TELEFONO(</w:t>
-      </w:r>
-      <w:proofErr w:type="spellStart"/>
+        <w:t>EVENTO(</w:t>
+      </w:r>
       <w:r>
         <w:rPr>
           <w:b/>
           <w:bCs/>
         </w:rPr>
-        <w:t>numero_identificacion</w:t>
-      </w:r>
-      <w:proofErr w:type="spellEnd"/>
+        <w:t xml:space="preserve">codigo PK</w:t>
+      </w:r>
+      <w:r>
+        <w:t xml:space="preserve">, nombre, descripcion, categoria, url_imagen, teatro, fecha_hora_inicio, fecha_hora_fin, capacidad_total, edad_minima, precio, observaciones, estado NOT NULL, fecha_creacion, id_ubicacion FK NOT NULL, numero_identificacion FK NOT NULL)</w:t>
+      </w:r>
+    </w:p>
+    <w:p>
+      <w:pPr>
+        <w:spacing w:after="140" w:line="276" w:lineRule="auto"/>
+      </w:pPr>
+      <w:r>
+        <w:t>RESERVA(</w:t>
+      </w:r>
       <w:r>
         <w:rPr>
           <w:b/>
           <w:bCs/>
         </w:rPr>
-        <w:t xml:space="preserve"> PK FK</w:t>
-      </w:r>
-      <w:r>
-        <w:t xml:space="preserve">, </w:t>
-      </w:r>
-      <w:proofErr w:type="spellStart"/>
+        <w:t xml:space="preserve">id_reserva PK</w:t>
+      </w:r>
+      <w:r>
+        <w:t xml:space="preserve">, fecha_hora, valor_total, numero_entradas, codigo_qr, observaciones, estado NOT NULL, numero_identificacion FK NOT NULL, codigo_evento FK NOT NULL)</w:t>
+      </w:r>
+    </w:p>
+    <w:p>
+      <w:pPr>
+        <w:pStyle w:val="Ttulo2"/>
+        <w:keepNext/>
+        <w:spacing w:before="200" w:after="100"/>
+      </w:pPr>
+      <w:r>
+        <w:lastRenderedPageBreak/>
+        <w:t>Pagos</w:t>
+      </w:r>
+    </w:p>
+    <w:p>
+      <w:pPr>
+        <w:spacing w:after="140" w:line="276" w:lineRule="auto"/>
+      </w:pPr>
+      <w:r>
+        <w:t>METODO_PAGO(</w:t>
+      </w:r>
       <w:r>
         <w:rPr>
           <w:b/>
           <w:bCs/>
         </w:rPr>
-        <w:t>telefono</w:t>
-      </w:r>
-      <w:proofErr w:type="spellEnd"/>
+        <w:t xml:space="preserve">id_metodo PK</w:t>
+      </w:r>
+      <w:r>
+        <w:t xml:space="preserve">, tipo, proveedor, referencia_visible, token_pasarela, activo, fecha_registro, numero_identificacion FK NOT NULL)</w:t>
+      </w:r>
+    </w:p>
+    <w:p>
+      <w:pPr>
+        <w:spacing w:after="140" w:line="276" w:lineRule="auto"/>
+      </w:pPr>
+      <w:r>
+        <w:t>PAGO(</w:t>
+      </w:r>
       <w:r>
         <w:rPr>
           <w:b/>
           <w:bCs/>
         </w:rPr>
-        <w:t xml:space="preserve"> PK</w:t>
-      </w:r>
-      <w:r>
-        <w:t>)</w:t>
-      </w:r>
-    </w:p>
-    <w:p>
-      <w:pPr>
-        <w:spacing w:after="140" w:line="276" w:lineRule="auto"/>
-      </w:pPr>
-      <w:r>
-        <w:t>ADMIN(</w:t>
-      </w:r>
-      <w:proofErr w:type="spellStart"/>
-      <w:r>
-        <w:rPr>
-          <w:b/>
-          <w:bCs/>
-        </w:rPr>
-        <w:t>numero_identificacion</w:t>
-      </w:r>
-      <w:proofErr w:type="spellEnd"/>
-      <w:r>
-        <w:rPr>
-          <w:b/>
-          <w:bCs/>
-        </w:rPr>
-        <w:t xml:space="preserve"> PK FK</w:t>
-      </w:r>
-      <w:r>
-        <w:t>, salario, horario)</w:t>
-      </w:r>
-    </w:p>
-    <w:p>
-      <w:pPr>
-        <w:spacing w:after="140" w:line="276" w:lineRule="auto"/>
-      </w:pPr>
-      <w:r>
-        <w:t>CLIENTE(</w:t>
-      </w:r>
-      <w:proofErr w:type="spellStart"/>
-      <w:r>
-        <w:rPr>
-          <w:b/>
-          <w:bCs/>
-        </w:rPr>
-        <w:t>numero_identificacion</w:t>
-      </w:r>
-      <w:proofErr w:type="spellEnd"/>
-      <w:r>
-        <w:rPr>
-          <w:b/>
-          <w:bCs/>
-        </w:rPr>
-        <w:t xml:space="preserve"> PK FK</w:t>
-      </w:r>
-      <w:r>
-        <w:t xml:space="preserve">, puntos, publicidad, </w:t>
-      </w:r>
-      <w:proofErr w:type="spellStart"/>
-      <w:r>
-        <w:t>fecha_nacimiento</w:t>
-      </w:r>
-      <w:proofErr w:type="spellEnd"/>
-      <w:r>
-        <w:t xml:space="preserve">, </w:t>
-      </w:r>
-      <w:proofErr w:type="spellStart"/>
-      <w:r>
-        <w:t>foto_perfil</w:t>
-      </w:r>
-      <w:proofErr w:type="spellEnd"/>
-      <w:r>
-        <w:t>, alias)</w:t>
-      </w:r>
-    </w:p>
-    <w:p>
-      <w:pPr>
-        <w:spacing w:after="140" w:line="276" w:lineRule="auto"/>
-      </w:pPr>
-      <w:r>
-        <w:t>AGENTE(</w:t>
-      </w:r>
-      <w:proofErr w:type="spellStart"/>
-      <w:r>
-        <w:rPr>
-          <w:b/>
-          <w:bCs/>
-        </w:rPr>
-        <w:t>numero_identificacion</w:t>
-      </w:r>
-      <w:proofErr w:type="spellEnd"/>
-      <w:r>
-        <w:rPr>
-          <w:b/>
-          <w:bCs/>
-        </w:rPr>
-        <w:t xml:space="preserve"> PK FK</w:t>
-      </w:r>
-      <w:r>
-        <w:t xml:space="preserve">, </w:t>
-      </w:r>
-      <w:proofErr w:type="spellStart"/>
-      <w:r>
-        <w:t>comision</w:t>
-      </w:r>
-      <w:proofErr w:type="spellEnd"/>
-      <w:r>
-        <w:t xml:space="preserve">, experiencia, </w:t>
-      </w:r>
-      <w:proofErr w:type="spellStart"/>
-      <w:r>
-        <w:t>nit</w:t>
-      </w:r>
-      <w:proofErr w:type="spellEnd"/>
-      <w:r>
-        <w:t xml:space="preserve">, </w:t>
-      </w:r>
-      <w:proofErr w:type="spellStart"/>
-      <w:r>
-        <w:t>razon_social</w:t>
-      </w:r>
-      <w:proofErr w:type="spellEnd"/>
-      <w:r>
-        <w:t xml:space="preserve">, </w:t>
-      </w:r>
-      <w:proofErr w:type="spellStart"/>
-      <w:r>
-        <w:t>nombre_comercial</w:t>
-      </w:r>
-      <w:proofErr w:type="spellEnd"/>
-      <w:r>
-        <w:t xml:space="preserve">, </w:t>
-      </w:r>
-      <w:proofErr w:type="spellStart"/>
-      <w:r>
-        <w:t>descripcion</w:t>
-      </w:r>
-      <w:proofErr w:type="spellEnd"/>
-      <w:r>
-        <w:t xml:space="preserve">, </w:t>
-      </w:r>
-      <w:proofErr w:type="spellStart"/>
-      <w:r>
-        <w:t>logo_url</w:t>
-      </w:r>
-      <w:proofErr w:type="spellEnd"/>
-      <w:r>
-        <w:t>)</w:t>
-      </w:r>
-    </w:p>
-    <w:p>
-      <w:pPr>
-        <w:pStyle w:val="Ttulo2"/>
-        <w:keepNext/>
-        <w:spacing w:before="200" w:after="100"/>
-      </w:pPr>
-      <w:r>
-        <w:t>Eventos y reservas</w:t>
-      </w:r>
-    </w:p>
-    <w:p>
-      <w:pPr>
-        <w:spacing w:after="140" w:line="276" w:lineRule="auto"/>
-      </w:pPr>
-      <w:r>
-        <w:t>EVENTO(</w:t>
-      </w:r>
-      <w:proofErr w:type="spellStart"/>
-      <w:r>
-        <w:rPr>
-          <w:b/>
-          <w:bCs/>
-        </w:rPr>
-        <w:t>codigo</w:t>
-      </w:r>
-      <w:proofErr w:type="spellEnd"/>
-      <w:r>
-        <w:rPr>
-          <w:b/>
-          <w:bCs/>
-        </w:rPr>
-        <w:t xml:space="preserve"> PK</w:t>
-      </w:r>
-      <w:r>
-        <w:t xml:space="preserve">, nombre, </w:t>
-      </w:r>
-      <w:proofErr w:type="spellStart"/>
-      <w:r>
-        <w:t>descripcion</w:t>
-      </w:r>
-      <w:proofErr w:type="spellEnd"/>
-      <w:r>
-        <w:t xml:space="preserve">, </w:t>
-      </w:r>
-      <w:proofErr w:type="spellStart"/>
-      <w:r>
-        <w:t>categoria</w:t>
-      </w:r>
-      <w:proofErr w:type="spellEnd"/>
-      <w:r>
-        <w:t xml:space="preserve">, </w:t>
-      </w:r>
-      <w:proofErr w:type="spellStart"/>
-      <w:r>
-        <w:t>url_imagen</w:t>
-      </w:r>
-      <w:proofErr w:type="spellEnd"/>
-      <w:r>
-        <w:t xml:space="preserve">, teatro, </w:t>
-      </w:r>
-      <w:proofErr w:type="spellStart"/>
-      <w:r>
-        <w:t>fecha_hora_inicio</w:t>
-      </w:r>
-      <w:proofErr w:type="spellEnd"/>
-      <w:r>
-        <w:t xml:space="preserve">, </w:t>
-      </w:r>
-      <w:proofErr w:type="spellStart"/>
-      <w:r>
-        <w:t>fecha_hora_fin</w:t>
-      </w:r>
-      <w:proofErr w:type="spellEnd"/>
-      <w:r>
-        <w:t xml:space="preserve">, </w:t>
-      </w:r>
-      <w:proofErr w:type="spellStart"/>
-      <w:r>
-        <w:t>capacidad_total</w:t>
-      </w:r>
-      <w:proofErr w:type="spellEnd"/>
-      <w:r>
-        <w:t xml:space="preserve">, </w:t>
-      </w:r>
-      <w:proofErr w:type="spellStart"/>
-      <w:r>
-        <w:t>edad_minima</w:t>
-      </w:r>
-      <w:proofErr w:type="spellEnd"/>
-      <w:r>
-        <w:t xml:space="preserve">, precio, observaciones, estado NOT NULL, </w:t>
-      </w:r>
-      <w:proofErr w:type="spellStart"/>
-      <w:r>
-        <w:t>fecha_creacion</w:t>
-      </w:r>
-      <w:proofErr w:type="spellEnd"/>
-      <w:r>
-        <w:t xml:space="preserve">, </w:t>
-      </w:r>
-      <w:proofErr w:type="spellStart"/>
-      <w:r>
-        <w:t>id_ubicacion</w:t>
-      </w:r>
-      <w:proofErr w:type="spellEnd"/>
-      <w:r>
-        <w:t xml:space="preserve"> FK NOT NULL, </w:t>
-      </w:r>
-      <w:proofErr w:type="spellStart"/>
-      <w:r>
-        <w:t>numero_identificacion</w:t>
-      </w:r>
-      <w:proofErr w:type="spellEnd"/>
-      <w:r>
-        <w:t xml:space="preserve"> FK NOT NULL)</w:t>
-      </w:r>
-    </w:p>
-    <w:p>
-      <w:pPr>
-        <w:spacing w:after="140" w:line="276" w:lineRule="auto"/>
-      </w:pPr>
-      <w:r>
-        <w:t>RESERVA(</w:t>
-      </w:r>
-      <w:proofErr w:type="spellStart"/>
-      <w:r>
-        <w:rPr>
-          <w:b/>
-          <w:bCs/>
-        </w:rPr>
-        <w:t>id_reserva</w:t>
-      </w:r>
-      <w:proofErr w:type="spellEnd"/>
-      <w:r>
-        <w:rPr>
-          <w:b/>
-          <w:bCs/>
-        </w:rPr>
-        <w:t xml:space="preserve"> PK</w:t>
-      </w:r>
-      <w:r>
-        <w:t xml:space="preserve">, </w:t>
-      </w:r>
-      <w:proofErr w:type="spellStart"/>
-      <w:r>
-        <w:t>fecha_hora</w:t>
-      </w:r>
-      <w:proofErr w:type="spellEnd"/>
-      <w:r>
-        <w:t xml:space="preserve">, </w:t>
-      </w:r>
-      <w:proofErr w:type="spellStart"/>
-      <w:r>
-        <w:t>valor_total</w:t>
-      </w:r>
-      <w:proofErr w:type="spellEnd"/>
-      <w:r>
-        <w:t xml:space="preserve">, </w:t>
-      </w:r>
-      <w:proofErr w:type="spellStart"/>
-      <w:r>
-        <w:t>numero_entradas</w:t>
-      </w:r>
-      <w:proofErr w:type="spellEnd"/>
-      <w:r>
-        <w:t xml:space="preserve">, </w:t>
-      </w:r>
-      <w:proofErr w:type="spellStart"/>
-      <w:r>
-        <w:t>codigo_qr</w:t>
-      </w:r>
-      <w:proofErr w:type="spellEnd"/>
-      <w:r>
-        <w:t xml:space="preserve">, observaciones, estado NOT NULL, </w:t>
-      </w:r>
-      <w:proofErr w:type="spellStart"/>
-      <w:r>
-        <w:t>numero_identificacion</w:t>
-      </w:r>
-      <w:proofErr w:type="spellEnd"/>
-      <w:r>
-        <w:t xml:space="preserve"> FK NOT NULL, </w:t>
-      </w:r>
-      <w:proofErr w:type="spellStart"/>
-      <w:r>
-        <w:t>codigo_evento</w:t>
-      </w:r>
-      <w:proofErr w:type="spellEnd"/>
-      <w:r>
-        <w:t xml:space="preserve"> FK NOT NULL)</w:t>
-      </w:r>
-    </w:p>
-    <w:p>
-      <w:pPr>
-        <w:pStyle w:val="Ttulo2"/>
-        <w:keepNext/>
-        <w:spacing w:before="200" w:after="100"/>
-      </w:pPr>
-      <w:r>
-        <w:lastRenderedPageBreak/>
-        <w:t>Pagos</w:t>
-      </w:r>
-    </w:p>
-    <w:p>
-      <w:pPr>
-        <w:spacing w:after="140" w:line="276" w:lineRule="auto"/>
-      </w:pPr>
-      <w:r>
-        <w:t>METODO_PAGO(</w:t>
-      </w:r>
-      <w:proofErr w:type="spellStart"/>
-      <w:r>
-        <w:rPr>
-          <w:b/>
-          <w:bCs/>
-        </w:rPr>
-        <w:t>id_metodo</w:t>
-      </w:r>
-      <w:proofErr w:type="spellEnd"/>
-      <w:r>
-        <w:rPr>
-          <w:b/>
-          <w:bCs/>
-        </w:rPr>
-        <w:t xml:space="preserve"> PK</w:t>
-      </w:r>
-      <w:r>
-        <w:t xml:space="preserve">, tipo, proveedor, </w:t>
-      </w:r>
-      <w:proofErr w:type="spellStart"/>
-      <w:r>
-        <w:t>referencia_visible</w:t>
-      </w:r>
-      <w:proofErr w:type="spellEnd"/>
-      <w:r>
-        <w:t xml:space="preserve">, </w:t>
-      </w:r>
-      <w:proofErr w:type="spellStart"/>
-      <w:r>
-        <w:t>token_pasarela</w:t>
-      </w:r>
-      <w:proofErr w:type="spellEnd"/>
-      <w:r>
-        <w:t xml:space="preserve">, activo, </w:t>
-      </w:r>
-      <w:proofErr w:type="spellStart"/>
-      <w:r>
-        <w:t>fecha_registro</w:t>
-      </w:r>
-      <w:proofErr w:type="spellEnd"/>
-      <w:r>
-        <w:t xml:space="preserve">, </w:t>
-      </w:r>
-      <w:proofErr w:type="spellStart"/>
-      <w:r>
-        <w:t>numero_identificacion</w:t>
-      </w:r>
-      <w:proofErr w:type="spellEnd"/>
-      <w:r>
-        <w:t xml:space="preserve"> FK NOT NULL)</w:t>
-      </w:r>
-    </w:p>
-    <w:p>
-      <w:pPr>
-        <w:spacing w:after="140" w:line="276" w:lineRule="auto"/>
-      </w:pPr>
-      <w:r>
-        <w:t>PAGO(</w:t>
-      </w:r>
-      <w:proofErr w:type="spellStart"/>
-      <w:r>
-        <w:rPr>
-          <w:b/>
-          <w:bCs/>
-        </w:rPr>
-        <w:t>id_pago</w:t>
-      </w:r>
-      <w:proofErr w:type="spellEnd"/>
-      <w:r>
-        <w:rPr>
-          <w:b/>
-          <w:bCs/>
-        </w:rPr>
-        <w:t xml:space="preserve"> PK</w:t>
-      </w:r>
-      <w:r>
-        <w:t xml:space="preserve">, monto, </w:t>
-      </w:r>
-      <w:proofErr w:type="spellStart"/>
-      <w:r>
-        <w:t>fecha_hora</w:t>
-      </w:r>
-      <w:proofErr w:type="spellEnd"/>
-      <w:r>
-        <w:t xml:space="preserve">, </w:t>
-      </w:r>
-      <w:proofErr w:type="spellStart"/>
-      <w:r>
-        <w:t>referencia_transaccion</w:t>
-      </w:r>
-      <w:proofErr w:type="spellEnd"/>
-      <w:r>
-        <w:t xml:space="preserve">, estado, </w:t>
-      </w:r>
-      <w:proofErr w:type="spellStart"/>
-      <w:r>
-        <w:t>id_reserva</w:t>
-      </w:r>
-      <w:proofErr w:type="spellEnd"/>
-      <w:r>
-        <w:t xml:space="preserve"> FK NOT NULL, </w:t>
-      </w:r>
-      <w:proofErr w:type="spellStart"/>
-      <w:r>
-        <w:t>id_metodo</w:t>
-      </w:r>
-      <w:proofErr w:type="spellEnd"/>
-      <w:r>
-        <w:t xml:space="preserve"> FK NOT NULL)</w:t>
+        <w:t xml:space="preserve">id_pago PK</w:t>
+      </w:r>
+      <w:r>
+        <w:t xml:space="preserve">, monto, fecha_hora, referencia_transaccion, estado, id_reserva FK NOT NULL, id_metodo FK NOT NULL)</w:t>
       </w:r>
     </w:p>
     <w:p>
@@ -4083,41 +3189,11 @@
           <w:lang w:val="en-US"/>
         </w:rPr>
       </w:pPr>
-      <w:proofErr w:type="spellStart"/>
       <w:r>
         <w:rPr>
           <w:lang w:val="en-US"/>
         </w:rPr>
-        <w:t>DEPARTAMENTO.id_pais</w:t>
-      </w:r>
-      <w:proofErr w:type="spellEnd"/>
-      <w:r>
-        <w:rPr>
-          <w:lang w:val="en-US"/>
-        </w:rPr>
-        <w:t xml:space="preserve"> → </w:t>
-      </w:r>
-      <w:proofErr w:type="gramStart"/>
-      <w:r>
-        <w:rPr>
-          <w:lang w:val="en-US"/>
-        </w:rPr>
-        <w:t>PAIS(</w:t>
-      </w:r>
-      <w:proofErr w:type="spellStart"/>
-      <w:proofErr w:type="gramEnd"/>
-      <w:r>
-        <w:rPr>
-          <w:lang w:val="en-US"/>
-        </w:rPr>
-        <w:t>id_pais</w:t>
-      </w:r>
-      <w:proofErr w:type="spellEnd"/>
-      <w:r>
-        <w:rPr>
-          <w:lang w:val="en-US"/>
-        </w:rPr>
-        <w:t>)</w:t>
+        <w:t xml:space="preserve">DEPARTAMENTO.id_pais → PAIS(id_pais)</w:t>
       </w:r>
     </w:p>
     <w:p>
@@ -4129,21 +3205,8 @@
         </w:numPr>
         <w:spacing w:after="60" w:line="276" w:lineRule="auto"/>
       </w:pPr>
-      <w:proofErr w:type="spellStart"/>
-      <w:r>
-        <w:t>CIUDAD.id_departamento</w:t>
-      </w:r>
-      <w:proofErr w:type="spellEnd"/>
-      <w:r>
-        <w:t xml:space="preserve"> → DEPARTAMENTO(</w:t>
-      </w:r>
-      <w:proofErr w:type="spellStart"/>
-      <w:r>
-        <w:t>id_departamento</w:t>
-      </w:r>
-      <w:proofErr w:type="spellEnd"/>
-      <w:r>
-        <w:t>)</w:t>
+      <w:r>
+        <w:t xml:space="preserve">CIUDAD.id_departamento → DEPARTAMENTO(id_departamento)</w:t>
       </w:r>
     </w:p>
     <w:p>
@@ -4155,29 +3218,8 @@
         </w:numPr>
         <w:spacing w:after="60" w:line="276" w:lineRule="auto"/>
       </w:pPr>
-      <w:proofErr w:type="spellStart"/>
-      <w:r>
-        <w:t>UBICACION.id_ciudad</w:t>
-      </w:r>
-      <w:proofErr w:type="spellEnd"/>
-      <w:r>
-        <w:t xml:space="preserve"> y </w:t>
-      </w:r>
-      <w:proofErr w:type="spellStart"/>
-      <w:r>
-        <w:t>USUARIO.id_ciudad</w:t>
-      </w:r>
-      <w:proofErr w:type="spellEnd"/>
-      <w:r>
-        <w:t xml:space="preserve"> → CIUDAD(</w:t>
-      </w:r>
-      <w:proofErr w:type="spellStart"/>
-      <w:r>
-        <w:t>id_ciudad</w:t>
-      </w:r>
-      <w:proofErr w:type="spellEnd"/>
-      <w:r>
-        <w:t>)</w:t>
+      <w:r>
+        <w:t xml:space="preserve">UBICACION.id_ciudad y USUARIO.id_ciudad → CIUDAD(id_ciudad)</w:t>
       </w:r>
     </w:p>
     <w:p>
@@ -4190,23 +3232,7 @@
         <w:spacing w:after="60" w:line="276" w:lineRule="auto"/>
       </w:pPr>
       <w:r>
-        <w:t xml:space="preserve">USUARIO_TELEFONO, ADMIN, CLIENTE y AGENTE: </w:t>
-      </w:r>
-      <w:proofErr w:type="spellStart"/>
-      <w:r>
-        <w:t>numero_identificacion</w:t>
-      </w:r>
-      <w:proofErr w:type="spellEnd"/>
-      <w:r>
-        <w:t xml:space="preserve"> → USUARIO(</w:t>
-      </w:r>
-      <w:proofErr w:type="spellStart"/>
-      <w:r>
-        <w:t>numero_identificacion</w:t>
-      </w:r>
-      <w:proofErr w:type="spellEnd"/>
-      <w:r>
-        <w:t>)</w:t>
+        <w:t xml:space="preserve">USUARIO_TELEFONO, ADMIN, CLIENTE y AGENTE: numero_identificacion → USUARIO(numero_identificacion)</w:t>
       </w:r>
     </w:p>
     <w:p>
@@ -4218,21 +3244,8 @@
         </w:numPr>
         <w:spacing w:after="60" w:line="276" w:lineRule="auto"/>
       </w:pPr>
-      <w:proofErr w:type="spellStart"/>
-      <w:r>
-        <w:t>EVENTO.id_ubicacion</w:t>
-      </w:r>
-      <w:proofErr w:type="spellEnd"/>
-      <w:r>
-        <w:t xml:space="preserve"> → UBICACION(</w:t>
-      </w:r>
-      <w:proofErr w:type="spellStart"/>
-      <w:r>
-        <w:t>id_ubicacion</w:t>
-      </w:r>
-      <w:proofErr w:type="spellEnd"/>
-      <w:r>
-        <w:t>)</w:t>
+      <w:r>
+        <w:t xml:space="preserve">EVENTO.id_ubicacion → UBICACION(id_ubicacion)</w:t>
       </w:r>
     </w:p>
     <w:p>
@@ -4244,21 +3257,8 @@
         </w:numPr>
         <w:spacing w:after="60" w:line="276" w:lineRule="auto"/>
       </w:pPr>
-      <w:proofErr w:type="spellStart"/>
-      <w:r>
-        <w:t>EVENTO.numero_identificacion</w:t>
-      </w:r>
-      <w:proofErr w:type="spellEnd"/>
-      <w:r>
-        <w:t xml:space="preserve"> → AGENTE(</w:t>
-      </w:r>
-      <w:proofErr w:type="spellStart"/>
-      <w:r>
-        <w:t>numero_identificacion</w:t>
-      </w:r>
-      <w:proofErr w:type="spellEnd"/>
-      <w:r>
-        <w:t>) (agente que registra el evento)</w:t>
+      <w:r>
+        <w:t xml:space="preserve">EVENTO.numero_identificacion → AGENTE(numero_identificacion) (agente que registra el evento)</w:t>
       </w:r>
     </w:p>
     <w:p>
@@ -4270,29 +3270,8 @@
         </w:numPr>
         <w:spacing w:after="60" w:line="276" w:lineRule="auto"/>
       </w:pPr>
-      <w:proofErr w:type="spellStart"/>
-      <w:r>
-        <w:t>RESERVA.numero_identificacion</w:t>
-      </w:r>
-      <w:proofErr w:type="spellEnd"/>
-      <w:r>
-        <w:t xml:space="preserve"> y </w:t>
-      </w:r>
-      <w:proofErr w:type="spellStart"/>
-      <w:r>
-        <w:t>METODO_PAGO.numero_identificacion</w:t>
-      </w:r>
-      <w:proofErr w:type="spellEnd"/>
-      <w:r>
-        <w:t xml:space="preserve"> → CLIENTE(</w:t>
-      </w:r>
-      <w:proofErr w:type="spellStart"/>
-      <w:r>
-        <w:t>numero_identificacion</w:t>
-      </w:r>
-      <w:proofErr w:type="spellEnd"/>
-      <w:r>
-        <w:t>)</w:t>
+      <w:r>
+        <w:t xml:space="preserve">RESERVA.numero_identificacion y METODO_PAGO.numero_identificacion → CLIENTE(numero_identificacion)</w:t>
       </w:r>
     </w:p>
     <w:p>
@@ -4304,21 +3283,8 @@
         </w:numPr>
         <w:spacing w:after="60" w:line="276" w:lineRule="auto"/>
       </w:pPr>
-      <w:proofErr w:type="spellStart"/>
-      <w:r>
-        <w:t>RESERVA.codigo_evento</w:t>
-      </w:r>
-      <w:proofErr w:type="spellEnd"/>
-      <w:r>
-        <w:t xml:space="preserve"> → EVENTO(</w:t>
-      </w:r>
-      <w:proofErr w:type="spellStart"/>
-      <w:r>
-        <w:t>codigo</w:t>
-      </w:r>
-      <w:proofErr w:type="spellEnd"/>
-      <w:r>
-        <w:t>)</w:t>
+      <w:r>
+        <w:t xml:space="preserve">RESERVA.codigo_evento → EVENTO(codigo)</w:t>
       </w:r>
     </w:p>
     <w:p>
@@ -4330,21 +3296,8 @@
         </w:numPr>
         <w:spacing w:after="60" w:line="276" w:lineRule="auto"/>
       </w:pPr>
-      <w:proofErr w:type="spellStart"/>
-      <w:r>
-        <w:t>PAGO.id_reserva</w:t>
-      </w:r>
-      <w:proofErr w:type="spellEnd"/>
-      <w:r>
-        <w:t xml:space="preserve"> → RESERVA(</w:t>
-      </w:r>
-      <w:proofErr w:type="spellStart"/>
-      <w:r>
-        <w:t>id_reserva</w:t>
-      </w:r>
-      <w:proofErr w:type="spellEnd"/>
-      <w:r>
-        <w:t>)</w:t>
+      <w:r>
+        <w:t xml:space="preserve">PAGO.id_reserva → RESERVA(id_reserva)</w:t>
       </w:r>
     </w:p>
     <w:p>
@@ -4356,21 +3309,8 @@
         </w:numPr>
         <w:spacing w:after="60" w:line="276" w:lineRule="auto"/>
       </w:pPr>
-      <w:proofErr w:type="spellStart"/>
-      <w:r>
-        <w:t>PAGO.id_metodo</w:t>
-      </w:r>
-      <w:proofErr w:type="spellEnd"/>
-      <w:r>
-        <w:t xml:space="preserve"> → METODO_PAGO(</w:t>
-      </w:r>
-      <w:proofErr w:type="spellStart"/>
-      <w:r>
-        <w:t>id_metodo</w:t>
-      </w:r>
-      <w:proofErr w:type="spellEnd"/>
-      <w:r>
-        <w:t>)</w:t>
+      <w:r>
+        <w:t xml:space="preserve">PAGO.id_metodo → METODO_PAGO(id_metodo)</w:t>
       </w:r>
     </w:p>
     <w:p>
@@ -4380,15 +3320,7 @@
         <w:spacing w:before="200" w:after="100"/>
       </w:pPr>
       <w:r>
-        <w:t xml:space="preserve">Restricciones del modelo (se implementan con CHECK y </w:t>
-      </w:r>
-      <w:proofErr w:type="spellStart"/>
-      <w:r>
-        <w:t>triggers</w:t>
-      </w:r>
-      <w:proofErr w:type="spellEnd"/>
-      <w:r>
-        <w:t>)</w:t>
+        <w:t xml:space="preserve">Restricciones del modelo (se implementan con CHECK y triggers)</w:t>
       </w:r>
     </w:p>
     <w:p>
@@ -4414,23 +3346,7 @@
         <w:spacing w:after="60" w:line="276" w:lineRule="auto"/>
       </w:pPr>
       <w:r>
-        <w:t xml:space="preserve">La edad del cliente (calculada con </w:t>
-      </w:r>
-      <w:proofErr w:type="spellStart"/>
-      <w:r>
-        <w:t>fecha_nacimiento</w:t>
-      </w:r>
-      <w:proofErr w:type="spellEnd"/>
-      <w:r>
-        <w:t xml:space="preserve">) debe ser mayor o igual a la </w:t>
-      </w:r>
-      <w:proofErr w:type="spellStart"/>
-      <w:r>
-        <w:t>edad_minima</w:t>
-      </w:r>
-      <w:proofErr w:type="spellEnd"/>
-      <w:r>
-        <w:t xml:space="preserve"> del evento.</w:t>
+        <w:t xml:space="preserve">La edad del cliente (calculada con fecha_nacimiento) debe ser mayor o igual a la edad_minima del evento.</w:t>
       </w:r>
     </w:p>
     <w:p>
@@ -4443,23 +3359,7 @@
         <w:spacing w:after="60" w:line="276" w:lineRule="auto"/>
       </w:pPr>
       <w:r>
-        <w:t xml:space="preserve">La suma de </w:t>
-      </w:r>
-      <w:proofErr w:type="spellStart"/>
-      <w:r>
-        <w:t>numero_entradas</w:t>
-      </w:r>
-      <w:proofErr w:type="spellEnd"/>
-      <w:r>
-        <w:t xml:space="preserve"> de las reservas no canceladas de un evento no puede superar su </w:t>
-      </w:r>
-      <w:proofErr w:type="spellStart"/>
-      <w:r>
-        <w:t>capacidad_total</w:t>
-      </w:r>
-      <w:proofErr w:type="spellEnd"/>
-      <w:r>
-        <w:t>.</w:t>
+        <w:t xml:space="preserve">La suma de numero_entradas de las reservas no canceladas de un evento no puede superar su capacidad_total.</w:t>
       </w:r>
     </w:p>
     <w:p>
@@ -4471,21 +3371,8 @@
         </w:numPr>
         <w:spacing w:after="60" w:line="276" w:lineRule="auto"/>
       </w:pPr>
-      <w:proofErr w:type="spellStart"/>
-      <w:r>
-        <w:t>valor_total</w:t>
-      </w:r>
-      <w:proofErr w:type="spellEnd"/>
-      <w:r>
-        <w:t xml:space="preserve"> de la reserva = </w:t>
-      </w:r>
-      <w:proofErr w:type="spellStart"/>
-      <w:r>
-        <w:t>numero_entradas</w:t>
-      </w:r>
-      <w:proofErr w:type="spellEnd"/>
-      <w:r>
-        <w:t xml:space="preserve"> × precio del evento.</w:t>
+      <w:r>
+        <w:t xml:space="preserve">valor_total de la reserva = numero_entradas × precio del evento + tarifa de Wompi (2,65 % + $700, más IVA; vale 0 si el evento es gratis).</w:t>
       </w:r>
     </w:p>
     <w:p>
@@ -4511,7 +3398,59 @@
         <w:spacing w:after="60" w:line="276" w:lineRule="auto"/>
       </w:pPr>
       <w:r>
-        <w:t>Estados obligatorios: EVENTO (Programado, En Boletería, En Vivo, Finalizado, Cancelado); RESERVA (Reservada, Confirmada, Cancelada).</w:t>
+        <w:t>Estados obligatorios: USUARIO (Activo, Pendiente, Suspendido, Bloqueado); EVENTO (En revisión, Rechazado, Programado, En Boletería, En Vivo, Finalizado, Cancelado); RESERVA (Reservada, Confirmada, Usada, Cancelada).</w:t>
+      </w:r>
+    </w:p>
+    <w:p>
+      <w:pPr>
+        <w:pStyle w:val="Prrafodelista"/>
+        <w:numPr>
+          <w:ilvl w:val="0"/>
+          <w:numId w:val="2"/>
+        </w:numPr>
+        <w:spacing w:after="60" w:line="276" w:lineRule="auto"/>
+      </w:pPr>
+      <w:r>
+        <w:t>Un agente que se registra queda Pendiente hasta que un administrador lo aprueba; una cuenta Suspendida (agente) o Bloqueada (cliente) no puede iniciar sesión.</w:t>
+      </w:r>
+    </w:p>
+    <w:p>
+      <w:pPr>
+        <w:pStyle w:val="Prrafodelista"/>
+        <w:numPr>
+          <w:ilvl w:val="0"/>
+          <w:numId w:val="2"/>
+        </w:numPr>
+        <w:spacing w:after="60" w:line="276" w:lineRule="auto"/>
+      </w:pPr>
+      <w:r>
+        <w:t>Un evento que registra un agente queda En revisión: el administrador lo aprueba (pasa a Programado y se publica) o lo rechaza (Rechazado). El motivo del rechazo y la causa de una cancelación se agregan a observaciones.</w:t>
+      </w:r>
+    </w:p>
+    <w:p>
+      <w:pPr>
+        <w:pStyle w:val="Prrafodelista"/>
+        <w:numPr>
+          <w:ilvl w:val="0"/>
+          <w:numId w:val="2"/>
+        </w:numPr>
+        <w:spacing w:after="60" w:line="276" w:lineRule="auto"/>
+      </w:pPr>
+      <w:r>
+        <w:t>Una reserva pasa a Usada cuando su entrada se valida en la puerta del evento; una entrada usada no se cancela ni se vuelve a usar.</w:t>
+      </w:r>
+    </w:p>
+    <w:p>
+      <w:pPr>
+        <w:pStyle w:val="Prrafodelista"/>
+        <w:numPr>
+          <w:ilvl w:val="0"/>
+          <w:numId w:val="2"/>
+        </w:numPr>
+        <w:spacing w:after="60" w:line="276" w:lineRule="auto"/>
+      </w:pPr>
+      <w:r>
+        <w:t>El código del evento (EVT-AAAA-NNNN) sale de la secuencia evento_numero_seq, así que nunca se repite.</w:t>
       </w:r>
     </w:p>
     <w:sectPr>

</xml_diff>